<commit_message>
ajouter boostrap, modif documentation, ajout .env.example
</commit_message>
<xml_diff>
--- a/documentation/0681407_healeyCoteMarieAndree_tp3.docx
+++ b/documentation/0681407_healeyCoteMarieAndree_tp3.docx
@@ -1846,15 +1846,7 @@
         <w:jc w:val="both"/>
       </w:pPr>
       <w:r>
-        <w:t xml:space="preserve">Ce projet a été réalisé dans le cadre du cours de Programmation Web avancée. Il consiste à développer une application web </w:t>
-      </w:r>
-      <w:proofErr w:type="spellStart"/>
-      <w:r>
-        <w:t>monopage</w:t>
-      </w:r>
-      <w:proofErr w:type="spellEnd"/>
-      <w:r>
-        <w:t xml:space="preserve"> (SPA) pour une agence de voyages permettant de gérer des forfaits touristiques.</w:t>
+        <w:t>Ce projet a été réalisé dans le cadre du cours de Programmation Web avancée. Il consiste à développer une application web monopage (SPA) pour une agence de voyages permettant de gérer des forfaits touristiques.</w:t>
       </w:r>
     </w:p>
     <w:p>
@@ -1870,15 +1862,13 @@
         <w:jc w:val="both"/>
       </w:pPr>
       <w:r>
-        <w:t xml:space="preserve">Une attention particulière a également été portée à l’interface utilisateur afin d’offrir une expérience moderne, intuitive et responsive grâce à l’utilisation de </w:t>
-      </w:r>
-      <w:proofErr w:type="spellStart"/>
-      <w:r>
-        <w:t>Tailwind</w:t>
-      </w:r>
-      <w:proofErr w:type="spellEnd"/>
-      <w:r>
-        <w:t xml:space="preserve"> CSS.</w:t>
+        <w:t>Une attention particulière a également été portée à l’interface utilisateur afin d’offrir une expérience moderne, intuitive et responsive grâce à l’utilisation de Tailwind CSS</w:t>
+      </w:r>
+      <w:r>
+        <w:t xml:space="preserve"> et Boostrap CSS</w:t>
+      </w:r>
+      <w:r>
+        <w:t>.</w:t>
       </w:r>
     </w:p>
     <w:p>
@@ -1898,15 +1888,7 @@
         <w:jc w:val="both"/>
       </w:pPr>
       <w:r>
-        <w:t xml:space="preserve">Ce projet consiste à développer une application web </w:t>
-      </w:r>
-      <w:proofErr w:type="spellStart"/>
-      <w:r>
-        <w:t>monopage</w:t>
-      </w:r>
-      <w:proofErr w:type="spellEnd"/>
-      <w:r>
-        <w:t xml:space="preserve"> (SPA) pour une agence de voyages spécialisée dans la gestion de forfaits touristiques.</w:t>
+        <w:t>Ce projet consiste à développer une application web monopage (SPA) pour une agence de voyages spécialisée dans la gestion de forfaits touristiques.</w:t>
       </w:r>
     </w:p>
     <w:p>
@@ -1930,15 +1912,13 @@
         <w:jc w:val="both"/>
       </w:pPr>
       <w:r>
-        <w:t xml:space="preserve">L’interface utilisateur est conçue avec </w:t>
-      </w:r>
-      <w:proofErr w:type="spellStart"/>
-      <w:r>
-        <w:t>Tailwind</w:t>
-      </w:r>
-      <w:proofErr w:type="spellEnd"/>
-      <w:r>
-        <w:t xml:space="preserve"> CSS afin d’offrir une expérience moderne, responsive et agréable.</w:t>
+        <w:t>L’interface utilisateur est conçue avec Tailwind CSS afin d’offrir une expérience moderne, responsive et agréable</w:t>
+      </w:r>
+      <w:r>
+        <w:t>, et Boostrap, pour le besoin du cours</w:t>
+      </w:r>
+      <w:r>
+        <w:t>.</w:t>
       </w:r>
     </w:p>
     <w:p>
@@ -2054,13 +2034,11 @@
           <w:numId w:val="2"/>
         </w:numPr>
       </w:pPr>
-      <w:proofErr w:type="spellStart"/>
-      <w:r>
-        <w:t>Tailwind</w:t>
-      </w:r>
-      <w:proofErr w:type="spellEnd"/>
-      <w:r>
-        <w:t xml:space="preserve"> CSS</w:t>
+      <w:r>
+        <w:t>Tailwind CSS</w:t>
+      </w:r>
+      <w:r>
+        <w:t xml:space="preserve"> et boostrap CSS</w:t>
       </w:r>
     </w:p>
     <w:p>
@@ -2282,31 +2260,8 @@
       <w:bookmarkEnd w:id="19"/>
     </w:p>
     <w:p>
-      <w:proofErr w:type="spellStart"/>
-      <w:proofErr w:type="gramStart"/>
-      <w:r>
-        <w:t>npm</w:t>
-      </w:r>
-      <w:proofErr w:type="spellEnd"/>
-      <w:proofErr w:type="gramEnd"/>
-      <w:r>
-        <w:t xml:space="preserve"> </w:t>
-      </w:r>
-      <w:proofErr w:type="spellStart"/>
-      <w:r>
-        <w:t>create</w:t>
-      </w:r>
-      <w:proofErr w:type="spellEnd"/>
-      <w:r>
-        <w:t xml:space="preserve"> </w:t>
-      </w:r>
-      <w:proofErr w:type="spellStart"/>
-      <w:r>
-        <w:t>vue@latest</w:t>
-      </w:r>
-      <w:proofErr w:type="spellEnd"/>
-      <w:r>
-        <w:t xml:space="preserve"> vue-app</w:t>
+      <w:r>
+        <w:t>npm create vue@latest vue-app</w:t>
       </w:r>
     </w:p>
     <w:p>
@@ -2319,21 +2274,20 @@
         <w:rPr>
           <w:lang w:val="en-CA"/>
         </w:rPr>
-        <w:t xml:space="preserve">cd </w:t>
-      </w:r>
-      <w:proofErr w:type="spellStart"/>
-      <w:r>
+        <w:t>cd vue-app</w:t>
+      </w:r>
+    </w:p>
+    <w:p>
+      <w:pPr>
         <w:rPr>
           <w:lang w:val="en-CA"/>
         </w:rPr>
-        <w:t>vue</w:t>
-      </w:r>
-      <w:proofErr w:type="spellEnd"/>
+      </w:pPr>
       <w:r>
         <w:rPr>
           <w:lang w:val="en-CA"/>
         </w:rPr>
-        <w:t>-app</w:t>
+        <w:t>npm install</w:t>
       </w:r>
     </w:p>
     <w:p>
@@ -2342,80 +2296,29 @@
           <w:lang w:val="en-CA"/>
         </w:rPr>
       </w:pPr>
-      <w:proofErr w:type="spellStart"/>
       <w:r>
         <w:rPr>
           <w:lang w:val="en-CA"/>
         </w:rPr>
-        <w:t>npm</w:t>
-      </w:r>
-      <w:proofErr w:type="spellEnd"/>
-      <w:r>
+        <w:t>npm install axios tailwindcss @tailwindcss/vite</w:t>
+      </w:r>
+    </w:p>
+    <w:p>
+      <w:pPr>
         <w:rPr>
           <w:lang w:val="en-CA"/>
         </w:rPr>
-        <w:t xml:space="preserve"> install</w:t>
-      </w:r>
-    </w:p>
-    <w:p>
-      <w:pPr>
+      </w:pPr>
+      <w:r>
         <w:rPr>
           <w:lang w:val="en-CA"/>
         </w:rPr>
-      </w:pPr>
-      <w:proofErr w:type="spellStart"/>
-      <w:r>
-        <w:rPr>
-          <w:lang w:val="en-CA"/>
-        </w:rPr>
-        <w:t>npm</w:t>
-      </w:r>
-      <w:proofErr w:type="spellEnd"/>
-      <w:r>
-        <w:rPr>
-          <w:lang w:val="en-CA"/>
-        </w:rPr>
-        <w:t xml:space="preserve"> install </w:t>
-      </w:r>
-      <w:proofErr w:type="spellStart"/>
-      <w:r>
-        <w:rPr>
-          <w:lang w:val="en-CA"/>
-        </w:rPr>
-        <w:t>axios</w:t>
-      </w:r>
-      <w:proofErr w:type="spellEnd"/>
-      <w:r>
-        <w:rPr>
-          <w:lang w:val="en-CA"/>
-        </w:rPr>
-        <w:t xml:space="preserve"> </w:t>
-      </w:r>
-      <w:proofErr w:type="spellStart"/>
-      <w:r>
-        <w:rPr>
-          <w:lang w:val="en-CA"/>
-        </w:rPr>
-        <w:t>tailwindcss</w:t>
-      </w:r>
-      <w:proofErr w:type="spellEnd"/>
-      <w:r>
-        <w:rPr>
-          <w:lang w:val="en-CA"/>
-        </w:rPr>
-        <w:t xml:space="preserve"> @tailwindcss/vite</w:t>
-      </w:r>
-    </w:p>
-    <w:p>
-      <w:proofErr w:type="spellStart"/>
-      <w:proofErr w:type="gramStart"/>
-      <w:r>
-        <w:t>npm</w:t>
-      </w:r>
-      <w:proofErr w:type="spellEnd"/>
-      <w:proofErr w:type="gramEnd"/>
-      <w:r>
-        <w:t xml:space="preserve"> run dev</w:t>
+        <w:t>npm install bootstrap</w:t>
+      </w:r>
+    </w:p>
+    <w:p>
+      <w:r>
+        <w:t>npm run dev</w:t>
       </w:r>
     </w:p>
     <w:p/>
@@ -2456,31 +2359,16 @@
           <w:lang w:val="en-CA"/>
         </w:rPr>
       </w:pPr>
-      <w:proofErr w:type="spellStart"/>
       <w:r>
         <w:rPr>
           <w:lang w:val="en-CA"/>
         </w:rPr>
-        <w:t>npm</w:t>
-      </w:r>
-      <w:proofErr w:type="spellEnd"/>
-      <w:r>
-        <w:rPr>
-          <w:lang w:val="en-CA"/>
-        </w:rPr>
-        <w:t xml:space="preserve"> install</w:t>
-      </w:r>
-    </w:p>
-    <w:p>
-      <w:proofErr w:type="spellStart"/>
-      <w:proofErr w:type="gramStart"/>
-      <w:r>
-        <w:t>npm</w:t>
-      </w:r>
-      <w:proofErr w:type="spellEnd"/>
-      <w:proofErr w:type="gramEnd"/>
-      <w:r>
-        <w:t xml:space="preserve"> run dev</w:t>
+        <w:t>npm install</w:t>
+      </w:r>
+    </w:p>
+    <w:p>
+      <w:r>
+        <w:t>npm run dev</w:t>
       </w:r>
     </w:p>
     <w:p/>
@@ -2503,15 +2391,7 @@
     </w:p>
     <w:p>
       <w:r>
-        <w:t xml:space="preserve">CREATE DATABASE </w:t>
-      </w:r>
-      <w:proofErr w:type="spellStart"/>
-      <w:r>
-        <w:t>agence_voyages</w:t>
-      </w:r>
-      <w:proofErr w:type="spellEnd"/>
-      <w:r>
-        <w:t>;</w:t>
+        <w:t>CREATE DATABASE agence_voyages;</w:t>
       </w:r>
     </w:p>
     <w:p>
@@ -2529,21 +2409,20 @@
         <w:rPr>
           <w:lang w:val="en-CA"/>
         </w:rPr>
-        <w:t xml:space="preserve">CREATE TABLE </w:t>
-      </w:r>
-      <w:proofErr w:type="spellStart"/>
-      <w:r>
+        <w:t>CREATE TABLE forfaits (</w:t>
+      </w:r>
+    </w:p>
+    <w:p>
+      <w:pPr>
         <w:rPr>
           <w:lang w:val="en-CA"/>
         </w:rPr>
-        <w:t>forfaits</w:t>
-      </w:r>
-      <w:proofErr w:type="spellEnd"/>
+      </w:pPr>
       <w:r>
         <w:rPr>
           <w:lang w:val="en-CA"/>
         </w:rPr>
-        <w:t xml:space="preserve"> (</w:t>
+        <w:t xml:space="preserve">    id INT AUTO_INCREMENT PRIMARY KEY,</w:t>
       </w:r>
     </w:p>
     <w:p>
@@ -2556,7 +2435,7 @@
         <w:rPr>
           <w:lang w:val="en-CA"/>
         </w:rPr>
-        <w:t xml:space="preserve">    id INT AUTO_INCREMENT PRIMARY KEY,</w:t>
+        <w:t xml:space="preserve">    nom VARCHAR(255) NOT NULL,</w:t>
       </w:r>
     </w:p>
     <w:p>
@@ -2569,21 +2448,20 @@
         <w:rPr>
           <w:lang w:val="en-CA"/>
         </w:rPr>
-        <w:t xml:space="preserve">    nom </w:t>
-      </w:r>
-      <w:proofErr w:type="gramStart"/>
-      <w:r>
+        <w:t xml:space="preserve">    description TEXT NOT NULL,</w:t>
+      </w:r>
+    </w:p>
+    <w:p>
+      <w:pPr>
         <w:rPr>
           <w:lang w:val="en-CA"/>
         </w:rPr>
-        <w:t>VARCHAR(</w:t>
-      </w:r>
-      <w:proofErr w:type="gramEnd"/>
+      </w:pPr>
       <w:r>
         <w:rPr>
           <w:lang w:val="en-CA"/>
         </w:rPr>
-        <w:t>255) NOT NULL,</w:t>
+        <w:t xml:space="preserve">    prix DECIMAL(10,2) NOT NULL,</w:t>
       </w:r>
     </w:p>
     <w:p>
@@ -2596,7 +2474,7 @@
         <w:rPr>
           <w:lang w:val="en-CA"/>
         </w:rPr>
-        <w:t xml:space="preserve">    description TEXT NOT NULL,</w:t>
+        <w:t xml:space="preserve">    image VARCHAR(500) NOT NULL,</w:t>
       </w:r>
     </w:p>
     <w:p>
@@ -2609,89 +2487,7 @@
         <w:rPr>
           <w:lang w:val="en-CA"/>
         </w:rPr>
-        <w:t xml:space="preserve">    prix </w:t>
-      </w:r>
-      <w:proofErr w:type="gramStart"/>
-      <w:r>
-        <w:rPr>
-          <w:lang w:val="en-CA"/>
-        </w:rPr>
-        <w:t>DECIMAL(</w:t>
-      </w:r>
-      <w:proofErr w:type="gramEnd"/>
-      <w:r>
-        <w:rPr>
-          <w:lang w:val="en-CA"/>
-        </w:rPr>
-        <w:t>10,2) NOT NULL,</w:t>
-      </w:r>
-    </w:p>
-    <w:p>
-      <w:pPr>
-        <w:rPr>
-          <w:lang w:val="en-CA"/>
-        </w:rPr>
-      </w:pPr>
-      <w:r>
-        <w:rPr>
-          <w:lang w:val="en-CA"/>
-        </w:rPr>
-        <w:t xml:space="preserve">    image </w:t>
-      </w:r>
-      <w:proofErr w:type="gramStart"/>
-      <w:r>
-        <w:rPr>
-          <w:lang w:val="en-CA"/>
-        </w:rPr>
-        <w:t>VARCHAR(</w:t>
-      </w:r>
-      <w:proofErr w:type="gramEnd"/>
-      <w:r>
-        <w:rPr>
-          <w:lang w:val="en-CA"/>
-        </w:rPr>
-        <w:t>500) NOT NULL,</w:t>
-      </w:r>
-    </w:p>
-    <w:p>
-      <w:pPr>
-        <w:rPr>
-          <w:lang w:val="en-CA"/>
-        </w:rPr>
-      </w:pPr>
-      <w:r>
-        <w:rPr>
-          <w:lang w:val="en-CA"/>
-        </w:rPr>
-        <w:t xml:space="preserve">    </w:t>
-      </w:r>
-      <w:proofErr w:type="spellStart"/>
-      <w:r>
-        <w:rPr>
-          <w:lang w:val="en-CA"/>
-        </w:rPr>
-        <w:t>categorie</w:t>
-      </w:r>
-      <w:proofErr w:type="spellEnd"/>
-      <w:r>
-        <w:rPr>
-          <w:lang w:val="en-CA"/>
-        </w:rPr>
-        <w:t xml:space="preserve"> </w:t>
-      </w:r>
-      <w:proofErr w:type="gramStart"/>
-      <w:r>
-        <w:rPr>
-          <w:lang w:val="en-CA"/>
-        </w:rPr>
-        <w:t>VARCHAR(</w:t>
-      </w:r>
-      <w:proofErr w:type="gramEnd"/>
-      <w:r>
-        <w:rPr>
-          <w:lang w:val="en-CA"/>
-        </w:rPr>
-        <w:t>100) NOT NULL</w:t>
+        <w:t xml:space="preserve">    categorie VARCHAR(100) NOT NULL</w:t>
       </w:r>
     </w:p>
     <w:p>
@@ -2732,13 +2528,8 @@
           <w:numId w:val="7"/>
         </w:numPr>
       </w:pPr>
-      <w:proofErr w:type="gramStart"/>
-      <w:r>
-        <w:t>src</w:t>
-      </w:r>
-      <w:proofErr w:type="gramEnd"/>
-      <w:r>
-        <w:t>/</w:t>
+      <w:r>
+        <w:t>src/</w:t>
       </w:r>
     </w:p>
     <w:p>
@@ -2748,13 +2539,8 @@
           <w:numId w:val="7"/>
         </w:numPr>
       </w:pPr>
-      <w:proofErr w:type="gramStart"/>
-      <w:r>
-        <w:t>assets</w:t>
-      </w:r>
-      <w:proofErr w:type="gramEnd"/>
-      <w:r>
-        <w:t>/</w:t>
+      <w:r>
+        <w:t>assets/</w:t>
       </w:r>
     </w:p>
     <w:p>
@@ -2764,13 +2550,8 @@
           <w:numId w:val="7"/>
         </w:numPr>
       </w:pPr>
-      <w:proofErr w:type="gramStart"/>
-      <w:r>
-        <w:t>components</w:t>
-      </w:r>
-      <w:proofErr w:type="gramEnd"/>
-      <w:r>
-        <w:t>/</w:t>
+      <w:r>
+        <w:t>components/</w:t>
       </w:r>
     </w:p>
     <w:p>
@@ -2780,15 +2561,8 @@
           <w:numId w:val="7"/>
         </w:numPr>
       </w:pPr>
-      <w:proofErr w:type="spellStart"/>
-      <w:proofErr w:type="gramStart"/>
-      <w:r>
-        <w:t>views</w:t>
-      </w:r>
-      <w:proofErr w:type="spellEnd"/>
-      <w:proofErr w:type="gramEnd"/>
-      <w:r>
-        <w:t>/</w:t>
+      <w:r>
+        <w:t>views/</w:t>
       </w:r>
     </w:p>
     <w:p>
@@ -2798,13 +2572,8 @@
           <w:numId w:val="7"/>
         </w:numPr>
       </w:pPr>
-      <w:proofErr w:type="gramStart"/>
-      <w:r>
-        <w:t>router</w:t>
-      </w:r>
-      <w:proofErr w:type="gramEnd"/>
-      <w:r>
-        <w:t>/</w:t>
+      <w:r>
+        <w:t>router/</w:t>
       </w:r>
     </w:p>
     <w:p>
@@ -2814,13 +2583,8 @@
           <w:numId w:val="7"/>
         </w:numPr>
       </w:pPr>
-      <w:proofErr w:type="gramStart"/>
-      <w:r>
-        <w:t>services</w:t>
-      </w:r>
-      <w:proofErr w:type="gramEnd"/>
-      <w:r>
-        <w:t>/</w:t>
+      <w:r>
+        <w:t>services/</w:t>
       </w:r>
     </w:p>
     <w:p>
@@ -2830,13 +2594,8 @@
           <w:numId w:val="7"/>
         </w:numPr>
       </w:pPr>
-      <w:proofErr w:type="gramStart"/>
-      <w:r>
-        <w:t>public</w:t>
-      </w:r>
-      <w:proofErr w:type="gramEnd"/>
-      <w:r>
-        <w:t>/</w:t>
+      <w:r>
+        <w:t>public/</w:t>
       </w:r>
     </w:p>
     <w:p>
@@ -2846,11 +2605,9 @@
           <w:numId w:val="7"/>
         </w:numPr>
       </w:pPr>
-      <w:proofErr w:type="spellStart"/>
       <w:r>
         <w:t>App.vue</w:t>
       </w:r>
-      <w:proofErr w:type="spellEnd"/>
     </w:p>
     <w:p>
       <w:pPr>
@@ -2883,13 +2640,8 @@
           <w:numId w:val="8"/>
         </w:numPr>
       </w:pPr>
-      <w:proofErr w:type="gramStart"/>
-      <w:r>
-        <w:t>app</w:t>
-      </w:r>
-      <w:proofErr w:type="gramEnd"/>
-      <w:r>
-        <w:t>/</w:t>
+      <w:r>
+        <w:t>app/</w:t>
       </w:r>
     </w:p>
     <w:p>
@@ -2899,13 +2651,8 @@
           <w:numId w:val="8"/>
         </w:numPr>
       </w:pPr>
-      <w:proofErr w:type="gramStart"/>
-      <w:r>
-        <w:t>config</w:t>
-      </w:r>
-      <w:proofErr w:type="gramEnd"/>
-      <w:r>
-        <w:t>/</w:t>
+      <w:r>
+        <w:t>config/</w:t>
       </w:r>
     </w:p>
     <w:p>
@@ -2915,15 +2662,8 @@
           <w:numId w:val="8"/>
         </w:numPr>
       </w:pPr>
-      <w:proofErr w:type="spellStart"/>
-      <w:proofErr w:type="gramStart"/>
-      <w:r>
-        <w:t>controllers</w:t>
-      </w:r>
-      <w:proofErr w:type="spellEnd"/>
-      <w:proofErr w:type="gramEnd"/>
-      <w:r>
-        <w:t>/</w:t>
+      <w:r>
+        <w:t>controllers/</w:t>
       </w:r>
     </w:p>
     <w:p>
@@ -2933,15 +2673,8 @@
           <w:numId w:val="8"/>
         </w:numPr>
       </w:pPr>
-      <w:proofErr w:type="spellStart"/>
-      <w:proofErr w:type="gramStart"/>
-      <w:r>
-        <w:t>models</w:t>
-      </w:r>
-      <w:proofErr w:type="spellEnd"/>
-      <w:proofErr w:type="gramEnd"/>
-      <w:r>
-        <w:t>/</w:t>
+      <w:r>
+        <w:t>models/</w:t>
       </w:r>
     </w:p>
     <w:p>
@@ -2951,13 +2684,8 @@
           <w:numId w:val="8"/>
         </w:numPr>
       </w:pPr>
-      <w:proofErr w:type="gramStart"/>
-      <w:r>
-        <w:t>routes</w:t>
-      </w:r>
-      <w:proofErr w:type="gramEnd"/>
-      <w:r>
-        <w:t>/</w:t>
+      <w:r>
+        <w:t>routes/</w:t>
       </w:r>
     </w:p>
     <w:p>
@@ -2978,16 +2706,9 @@
           <w:numId w:val="8"/>
         </w:numPr>
       </w:pPr>
-      <w:proofErr w:type="gramStart"/>
-      <w:r>
-        <w:t>.</w:t>
-      </w:r>
-      <w:proofErr w:type="spellStart"/>
-      <w:r>
-        <w:t>env</w:t>
-      </w:r>
-      <w:proofErr w:type="spellEnd"/>
-      <w:proofErr w:type="gramEnd"/>
+      <w:r>
+        <w:t>.env</w:t>
+      </w:r>
     </w:p>
     <w:p/>
     <w:p>
@@ -5836,7 +5557,7 @@
   <w:rsids>
     <w:rsidRoot w:val="00FB20EF"/>
     <w:rsid w:val="004F291A"/>
-    <w:rsid w:val="005E5DF8"/>
+    <w:rsid w:val="006E05DD"/>
     <w:rsid w:val="00FB20EF"/>
   </w:rsids>
   <m:mathPr>

</xml_diff>